<commit_message>
Editado arquivo do manual de operação.
</commit_message>
<xml_diff>
--- a/BLE_BLUETOOTH_BAUDRATECHANGER/Manual_Básico_De_Operação.docx
+++ b/BLE_BLUETOOTH_BAUDRATECHANGER/Manual_Básico_De_Operação.docx
@@ -24,18 +24,18 @@
       </w:pPr>
       <w:r>
         <w:drawing>
-          <wp:anchor distT="0" distB="0" distL="114300" distR="114300" simplePos="0" relativeHeight="251711488" behindDoc="0" locked="0" layoutInCell="1" allowOverlap="1" wp14:anchorId="7945F997" wp14:editId="4930990D">
+          <wp:anchor distT="0" distB="0" distL="114300" distR="114300" simplePos="0" relativeHeight="251711488" behindDoc="0" locked="0" layoutInCell="1" allowOverlap="1" wp14:anchorId="7AE18DAF" wp14:editId="29AACE4A">
             <wp:simplePos x="0" y="0"/>
             <wp:positionH relativeFrom="column">
-              <wp:posOffset>4606290</wp:posOffset>
+              <wp:posOffset>4655185</wp:posOffset>
             </wp:positionH>
             <wp:positionV relativeFrom="paragraph">
-              <wp:posOffset>249251</wp:posOffset>
+              <wp:posOffset>205740</wp:posOffset>
             </wp:positionV>
-            <wp:extent cx="2229161" cy="6763694"/>
-            <wp:effectExtent l="38100" t="38100" r="38100" b="37465"/>
+            <wp:extent cx="2022475" cy="6191885"/>
+            <wp:effectExtent l="19050" t="19050" r="15875" b="18415"/>
             <wp:wrapSquare wrapText="bothSides"/>
-            <wp:docPr id="1132560955" name="Imagem 1"/>
+            <wp:docPr id="1966231795" name="Imagem 1"/>
             <wp:cNvGraphicFramePr>
               <a:graphicFrameLocks xmlns:a="http://schemas.openxmlformats.org/drawingml/2006/main" noChangeAspect="1"/>
             </wp:cNvGraphicFramePr>
@@ -43,7 +43,7 @@
               <a:graphicData uri="http://schemas.openxmlformats.org/drawingml/2006/picture">
                 <pic:pic xmlns:pic="http://schemas.openxmlformats.org/drawingml/2006/picture">
                   <pic:nvPicPr>
-                    <pic:cNvPr id="1132560955" name=""/>
+                    <pic:cNvPr id="1966231795" name=""/>
                     <pic:cNvPicPr/>
                   </pic:nvPicPr>
                   <pic:blipFill>
@@ -61,12 +61,12 @@
                   <pic:spPr>
                     <a:xfrm>
                       <a:off x="0" y="0"/>
-                      <a:ext cx="2229161" cy="6763694"/>
+                      <a:ext cx="2022475" cy="6191885"/>
                     </a:xfrm>
                     <a:prstGeom prst="rect">
                       <a:avLst/>
                     </a:prstGeom>
-                    <a:ln w="22225">
+                    <a:ln w="12700">
                       <a:solidFill>
                         <a:srgbClr val="000000"/>
                       </a:solidFill>
@@ -97,7 +97,7 @@
         <mc:AlternateContent>
           <mc:Choice Requires="wps">
             <w:drawing>
-              <wp:anchor distT="0" distB="0" distL="114300" distR="114300" simplePos="0" relativeHeight="251703296" behindDoc="0" locked="0" layoutInCell="1" allowOverlap="1" wp14:anchorId="787E64E1" wp14:editId="059E088F">
+              <wp:anchor distT="0" distB="0" distL="114300" distR="114300" simplePos="0" relativeHeight="251703296" behindDoc="0" locked="0" layoutInCell="1" allowOverlap="1" wp14:anchorId="787E64E1" wp14:editId="385A26BB">
                 <wp:simplePos x="0" y="0"/>
                 <wp:positionH relativeFrom="column">
                   <wp:posOffset>-1624330</wp:posOffset>
@@ -325,11 +325,11 @@
       </w:r>
       <w:proofErr w:type="spellEnd"/>
       <w:r>
-        <w:t xml:space="preserve"> no r</w:t>
-      </w:r>
-      <w:proofErr w:type="spellStart"/>
-      <w:r>
-        <w:t>ótulo</w:t>
+        <w:t xml:space="preserve"> no </w:t>
+      </w:r>
+      <w:proofErr w:type="spellStart"/>
+      <w:r>
+        <w:t>rótulo</w:t>
       </w:r>
       <w:proofErr w:type="spellEnd"/>
       <w:r>
@@ -1213,11 +1213,11 @@
         <w:t xml:space="preserve"> n</w:t>
       </w:r>
       <w:r>
-        <w:t>o t</w:t>
-      </w:r>
-      <w:proofErr w:type="spellStart"/>
-      <w:r>
-        <w:t>ipo</w:t>
+        <w:t xml:space="preserve">o </w:t>
+      </w:r>
+      <w:proofErr w:type="spellStart"/>
+      <w:r>
+        <w:t>tipo</w:t>
       </w:r>
       <w:proofErr w:type="spellEnd"/>
       <w:r>
@@ -1889,14 +1889,7 @@
           <w:b/>
           <w:bCs/>
         </w:rPr>
-        <w:t>UART=9600,0,0</w:t>
-      </w:r>
-      <w:r>
-        <w:rPr>
-          <w:b/>
-          <w:bCs/>
-        </w:rPr>
-        <w:t>\r\n</w:t>
+        <w:t>UART=9600,0,0\r\n</w:t>
       </w:r>
       <w:r>
         <w:rPr>
@@ -1910,21 +1903,7 @@
           <w:b/>
           <w:bCs/>
         </w:rPr>
-        <w:t xml:space="preserve">      </w:t>
-      </w:r>
-      <w:r>
-        <w:rPr>
-          <w:b/>
-          <w:bCs/>
-        </w:rPr>
-        <w:t xml:space="preserve">      </w:t>
-      </w:r>
-      <w:r>
-        <w:rPr>
-          <w:b/>
-          <w:bCs/>
-        </w:rPr>
-        <w:t>-</w:t>
+        <w:t xml:space="preserve">            -</w:t>
       </w:r>
       <w:proofErr w:type="gramStart"/>
       <w:r>
@@ -2112,21 +2091,7 @@
           <w:b/>
           <w:bCs/>
         </w:rPr>
-        <w:t xml:space="preserve"> </w:t>
-      </w:r>
-      <w:r>
-        <w:rPr>
-          <w:b/>
-          <w:bCs/>
-        </w:rPr>
-        <w:t xml:space="preserve">     </w:t>
-      </w:r>
-      <w:r>
-        <w:rPr>
-          <w:b/>
-          <w:bCs/>
-        </w:rPr>
-        <w:t xml:space="preserve"> -</w:t>
+        <w:t xml:space="preserve">       -</w:t>
       </w:r>
       <w:proofErr w:type="gramStart"/>
       <w:r>
@@ -2134,14 +2099,7 @@
           <w:b/>
           <w:bCs/>
         </w:rPr>
-        <w:t xml:space="preserve">&gt;  </w:t>
-      </w:r>
-      <w:r>
-        <w:rPr>
-          <w:b/>
-          <w:bCs/>
-        </w:rPr>
-        <w:t>5</w:t>
+        <w:t>&gt;  5</w:t>
       </w:r>
       <w:proofErr w:type="gramEnd"/>
       <w:r>
@@ -2208,28 +2166,7 @@
           <w:b/>
           <w:bCs/>
         </w:rPr>
-        <w:t xml:space="preserve">    </w:t>
-      </w:r>
-      <w:r>
-        <w:rPr>
-          <w:b/>
-          <w:bCs/>
-        </w:rPr>
-        <w:t xml:space="preserve"> </w:t>
-      </w:r>
-      <w:r>
-        <w:rPr>
-          <w:b/>
-          <w:bCs/>
-        </w:rPr>
-        <w:t xml:space="preserve"> </w:t>
-      </w:r>
-      <w:r>
-        <w:rPr>
-          <w:b/>
-          <w:bCs/>
-        </w:rPr>
-        <w:t xml:space="preserve"> -</w:t>
+        <w:t xml:space="preserve">       -</w:t>
       </w:r>
       <w:proofErr w:type="gramStart"/>
       <w:r>
@@ -2237,14 +2174,7 @@
           <w:b/>
           <w:bCs/>
         </w:rPr>
-        <w:t xml:space="preserve">&gt;  </w:t>
-      </w:r>
-      <w:r>
-        <w:rPr>
-          <w:b/>
-          <w:bCs/>
-        </w:rPr>
-        <w:t>6</w:t>
+        <w:t>&gt;  6</w:t>
       </w:r>
       <w:proofErr w:type="gramEnd"/>
       <w:r>
@@ -2327,35 +2257,7 @@
           <w:b/>
           <w:bCs/>
         </w:rPr>
-        <w:t xml:space="preserve">  </w:t>
-      </w:r>
-      <w:r>
-        <w:rPr>
-          <w:b/>
-          <w:bCs/>
-        </w:rPr>
-        <w:t xml:space="preserve">    </w:t>
-      </w:r>
-      <w:r>
-        <w:rPr>
-          <w:b/>
-          <w:bCs/>
-        </w:rPr>
-        <w:t xml:space="preserve">-&gt;  </w:t>
-      </w:r>
-      <w:r>
-        <w:rPr>
-          <w:b/>
-          <w:bCs/>
-        </w:rPr>
-        <w:t>7</w:t>
-      </w:r>
-      <w:r>
-        <w:rPr>
-          <w:b/>
-          <w:bCs/>
-        </w:rPr>
-        <w:t xml:space="preserve"> piscadas</w:t>
+        <w:t xml:space="preserve">      -&gt;  7 piscadas</w:t>
       </w:r>
     </w:p>
     <w:p>
@@ -2458,21 +2360,7 @@
           <w:b/>
           <w:bCs/>
         </w:rPr>
-        <w:t xml:space="preserve"> </w:t>
-      </w:r>
-      <w:r>
-        <w:rPr>
-          <w:b/>
-          <w:bCs/>
-        </w:rPr>
-        <w:t xml:space="preserve">8 </w:t>
-      </w:r>
-      <w:r>
-        <w:rPr>
-          <w:b/>
-          <w:bCs/>
-        </w:rPr>
-        <w:t>piscadas</w:t>
+        <w:t xml:space="preserve"> 8 piscadas</w:t>
       </w:r>
     </w:p>
     <w:p>

</xml_diff>

<commit_message>
Corrigido Manual de operações.
</commit_message>
<xml_diff>
--- a/BLE_BLUETOOTH_BAUDRATECHANGER/Manual_Básico_De_Operação.docx
+++ b/BLE_BLUETOOTH_BAUDRATECHANGER/Manual_Básico_De_Operação.docx
@@ -23,6 +23,9 @@
         <w:jc w:val="both"/>
       </w:pPr>
       <w:r>
+        <w:rPr>
+          <w:noProof/>
+        </w:rPr>
         <w:drawing>
           <wp:anchor distT="0" distB="0" distL="114300" distR="114300" simplePos="0" relativeHeight="251711488" behindDoc="0" locked="0" layoutInCell="1" allowOverlap="1" wp14:anchorId="7AE18DAF" wp14:editId="29AACE4A">
             <wp:simplePos x="0" y="0"/>
@@ -89,10 +92,16 @@
       <w:pPr>
         <w:ind w:right="-1065"/>
         <w:jc w:val="both"/>
+        <w:rPr>
+          <w:sz w:val="24"/>
+          <w:szCs w:val="24"/>
+        </w:rPr>
       </w:pPr>
       <w:r>
         <w:rPr>
           <w:noProof/>
+          <w:sz w:val="24"/>
+          <w:szCs w:val="24"/>
         </w:rPr>
         <mc:AlternateContent>
           <mc:Choice Requires="wps">
@@ -226,277 +235,109 @@
         </mc:AlternateContent>
       </w:r>
       <w:r>
-        <w:t xml:space="preserve">Ao </w:t>
+        <w:rPr>
+          <w:sz w:val="24"/>
+          <w:szCs w:val="24"/>
+        </w:rPr>
+        <w:t>Ao ligar</w:t>
+      </w:r>
+      <w:r>
+        <w:rPr>
+          <w:sz w:val="24"/>
+          <w:szCs w:val="24"/>
+        </w:rPr>
+        <w:t xml:space="preserve"> </w:t>
+      </w:r>
+      <w:r>
+        <w:rPr>
+          <w:sz w:val="24"/>
+          <w:szCs w:val="24"/>
+        </w:rPr>
+        <w:t xml:space="preserve">o </w:t>
       </w:r>
       <w:proofErr w:type="spellStart"/>
       <w:r>
-        <w:t>ligar</w:t>
+        <w:rPr>
+          <w:sz w:val="24"/>
+          <w:szCs w:val="24"/>
+        </w:rPr>
+        <w:t>Blackpill</w:t>
       </w:r>
       <w:proofErr w:type="spellEnd"/>
       <w:r>
+        <w:rPr>
+          <w:sz w:val="24"/>
+          <w:szCs w:val="24"/>
+        </w:rPr>
+        <w:t xml:space="preserve">, o programa entra no modo verificação. Neste modo, quando pressionado um botão, o LED piscará o número de vezes </w:t>
+      </w:r>
+      <w:r>
+        <w:rPr>
+          <w:sz w:val="24"/>
+          <w:szCs w:val="24"/>
+        </w:rPr>
+        <w:t>indicado no rótulo do botão se estiver configurado naquela velocidade</w:t>
+      </w:r>
+      <w:r>
+        <w:rPr>
+          <w:sz w:val="24"/>
+          <w:szCs w:val="24"/>
+        </w:rPr>
+        <w:t xml:space="preserve">.  Se </w:t>
+      </w:r>
+      <w:r>
+        <w:rPr>
+          <w:sz w:val="24"/>
+          <w:szCs w:val="24"/>
+        </w:rPr>
+        <w:t>não estiver configurado na velocidade indicada no rótulo do botão</w:t>
+      </w:r>
+      <w:r>
+        <w:rPr>
+          <w:sz w:val="24"/>
+          <w:szCs w:val="24"/>
+        </w:rPr>
+        <w:t xml:space="preserve">, o LED piscará </w:t>
+      </w:r>
+      <w:r>
+        <w:rPr>
+          <w:sz w:val="24"/>
+          <w:szCs w:val="24"/>
+        </w:rPr>
         <w:t xml:space="preserve"> </w:t>
       </w:r>
       <w:r>
-        <w:t xml:space="preserve">o </w:t>
-      </w:r>
-      <w:proofErr w:type="spellStart"/>
-      <w:r>
-        <w:t>Blackpill</w:t>
-      </w:r>
-      <w:proofErr w:type="spellEnd"/>
-      <w:r>
-        <w:t xml:space="preserve">, o </w:t>
-      </w:r>
-      <w:proofErr w:type="spellStart"/>
-      <w:r>
-        <w:t>programa</w:t>
-      </w:r>
-      <w:proofErr w:type="spellEnd"/>
-      <w:r>
-        <w:t xml:space="preserve"> </w:t>
-      </w:r>
-      <w:proofErr w:type="spellStart"/>
-      <w:r>
-        <w:t>entra</w:t>
-      </w:r>
-      <w:proofErr w:type="spellEnd"/>
-      <w:r>
-        <w:t xml:space="preserve"> no modo </w:t>
-      </w:r>
-      <w:proofErr w:type="spellStart"/>
-      <w:r>
-        <w:t>verificação</w:t>
-      </w:r>
-      <w:proofErr w:type="spellEnd"/>
-      <w:r>
-        <w:t xml:space="preserve">. Neste modo, </w:t>
-      </w:r>
-      <w:proofErr w:type="spellStart"/>
-      <w:r>
-        <w:t>quando</w:t>
-      </w:r>
-      <w:proofErr w:type="spellEnd"/>
-      <w:r>
-        <w:t xml:space="preserve"> </w:t>
-      </w:r>
-      <w:proofErr w:type="spellStart"/>
-      <w:r>
-        <w:t>pressionado</w:t>
-      </w:r>
-      <w:proofErr w:type="spellEnd"/>
-      <w:r>
-        <w:t xml:space="preserve"> um </w:t>
-      </w:r>
-      <w:proofErr w:type="spellStart"/>
-      <w:r>
-        <w:t>botão</w:t>
-      </w:r>
-      <w:proofErr w:type="spellEnd"/>
-      <w:r>
-        <w:t xml:space="preserve">, o LED </w:t>
-      </w:r>
-      <w:proofErr w:type="spellStart"/>
-      <w:r>
-        <w:t>piscará</w:t>
-      </w:r>
-      <w:proofErr w:type="spellEnd"/>
-      <w:r>
-        <w:t xml:space="preserve"> o </w:t>
-      </w:r>
-      <w:proofErr w:type="spellStart"/>
-      <w:r>
-        <w:t>número</w:t>
-      </w:r>
-      <w:proofErr w:type="spellEnd"/>
-      <w:r>
-        <w:t xml:space="preserve"> de </w:t>
-      </w:r>
-      <w:proofErr w:type="spellStart"/>
-      <w:r>
-        <w:t>vezes</w:t>
-      </w:r>
-      <w:proofErr w:type="spellEnd"/>
-      <w:r>
-        <w:t xml:space="preserve"> </w:t>
-      </w:r>
-      <w:proofErr w:type="spellStart"/>
-      <w:r>
-        <w:t>indicado</w:t>
-      </w:r>
-      <w:proofErr w:type="spellEnd"/>
-      <w:r>
-        <w:t xml:space="preserve"> no </w:t>
-      </w:r>
-      <w:proofErr w:type="spellStart"/>
-      <w:r>
-        <w:t>rótulo</w:t>
-      </w:r>
-      <w:proofErr w:type="spellEnd"/>
-      <w:r>
-        <w:t xml:space="preserve"> do </w:t>
-      </w:r>
-      <w:proofErr w:type="spellStart"/>
-      <w:r>
-        <w:t>botão</w:t>
-      </w:r>
-      <w:proofErr w:type="spellEnd"/>
-      <w:r>
-        <w:t xml:space="preserve"> se </w:t>
-      </w:r>
-      <w:proofErr w:type="spellStart"/>
-      <w:r>
-        <w:t>estiver</w:t>
-      </w:r>
-      <w:proofErr w:type="spellEnd"/>
-      <w:r>
-        <w:t xml:space="preserve"> </w:t>
-      </w:r>
-      <w:proofErr w:type="spellStart"/>
-      <w:r>
-        <w:t>configurado</w:t>
-      </w:r>
-      <w:proofErr w:type="spellEnd"/>
-      <w:r>
-        <w:t xml:space="preserve"> </w:t>
-      </w:r>
-      <w:proofErr w:type="spellStart"/>
-      <w:r>
-        <w:t>naquela</w:t>
-      </w:r>
-      <w:proofErr w:type="spellEnd"/>
-      <w:r>
-        <w:t xml:space="preserve"> </w:t>
-      </w:r>
-      <w:proofErr w:type="spellStart"/>
-      <w:r>
-        <w:t>velocidade</w:t>
-      </w:r>
-      <w:proofErr w:type="spellEnd"/>
-      <w:r>
-        <w:t xml:space="preserve">.  Se </w:t>
-      </w:r>
-      <w:proofErr w:type="spellStart"/>
-      <w:r>
-        <w:t>não</w:t>
-      </w:r>
-      <w:proofErr w:type="spellEnd"/>
-      <w:r>
-        <w:t xml:space="preserve"> </w:t>
-      </w:r>
-      <w:proofErr w:type="spellStart"/>
-      <w:r>
-        <w:t>estiver</w:t>
-      </w:r>
-      <w:proofErr w:type="spellEnd"/>
-      <w:r>
-        <w:t xml:space="preserve"> </w:t>
-      </w:r>
-      <w:proofErr w:type="spellStart"/>
-      <w:r>
-        <w:t>configurado</w:t>
-      </w:r>
-      <w:proofErr w:type="spellEnd"/>
-      <w:r>
-        <w:t xml:space="preserve"> </w:t>
-      </w:r>
-      <w:proofErr w:type="spellStart"/>
-      <w:r>
-        <w:t>na</w:t>
-      </w:r>
-      <w:proofErr w:type="spellEnd"/>
-      <w:r>
-        <w:t xml:space="preserve"> </w:t>
-      </w:r>
-      <w:proofErr w:type="spellStart"/>
-      <w:r>
-        <w:t>velocidade</w:t>
-      </w:r>
-      <w:proofErr w:type="spellEnd"/>
-      <w:r>
-        <w:t xml:space="preserve"> </w:t>
-      </w:r>
-      <w:proofErr w:type="spellStart"/>
-      <w:r>
-        <w:t>indicada</w:t>
-      </w:r>
-      <w:proofErr w:type="spellEnd"/>
-      <w:r>
-        <w:t xml:space="preserve"> no </w:t>
-      </w:r>
-      <w:proofErr w:type="spellStart"/>
-      <w:r>
-        <w:t>rótulo</w:t>
-      </w:r>
-      <w:proofErr w:type="spellEnd"/>
-      <w:r>
-        <w:t xml:space="preserve"> do </w:t>
-      </w:r>
-      <w:proofErr w:type="spellStart"/>
-      <w:r>
-        <w:t>botão</w:t>
-      </w:r>
-      <w:proofErr w:type="spellEnd"/>
-      <w:r>
-        <w:t xml:space="preserve">, o LED </w:t>
-      </w:r>
-      <w:proofErr w:type="spellStart"/>
-      <w:proofErr w:type="gramStart"/>
-      <w:r>
-        <w:t>piscará</w:t>
-      </w:r>
-      <w:proofErr w:type="spellEnd"/>
-      <w:r>
-        <w:t xml:space="preserve"> </w:t>
-      </w:r>
-      <w:r>
-        <w:t xml:space="preserve"> </w:t>
-      </w:r>
-      <w:r>
-        <w:t>10</w:t>
-      </w:r>
-      <w:proofErr w:type="gramEnd"/>
-      <w:r>
-        <w:t xml:space="preserve"> </w:t>
-      </w:r>
-      <w:proofErr w:type="spellStart"/>
-      <w:r>
-        <w:t>vezes</w:t>
-      </w:r>
-      <w:proofErr w:type="spellEnd"/>
-      <w:r>
-        <w:t xml:space="preserve"> </w:t>
-      </w:r>
-      <w:proofErr w:type="spellStart"/>
-      <w:r>
-        <w:t>bem</w:t>
-      </w:r>
-      <w:proofErr w:type="spellEnd"/>
-      <w:r>
-        <w:t xml:space="preserve"> </w:t>
-      </w:r>
-      <w:proofErr w:type="spellStart"/>
-      <w:r>
-        <w:t>rapidamente</w:t>
-      </w:r>
-      <w:proofErr w:type="spellEnd"/>
-      <w:r>
-        <w:t>.</w:t>
+        <w:rPr>
+          <w:sz w:val="24"/>
+          <w:szCs w:val="24"/>
+        </w:rPr>
+        <w:t>10 vezes bem rapidamente.</w:t>
       </w:r>
     </w:p>
     <w:p>
       <w:pPr>
         <w:ind w:right="-1065"/>
         <w:jc w:val="both"/>
+        <w:rPr>
+          <w:sz w:val="24"/>
+          <w:szCs w:val="24"/>
+        </w:rPr>
       </w:pPr>
     </w:p>
     <w:p>
       <w:pPr>
         <w:ind w:right="-1065"/>
         <w:jc w:val="both"/>
+        <w:rPr>
+          <w:sz w:val="24"/>
+          <w:szCs w:val="24"/>
+        </w:rPr>
       </w:pPr>
       <w:r>
         <w:rPr>
           <w:noProof/>
+          <w:sz w:val="24"/>
+          <w:szCs w:val="24"/>
         </w:rPr>
         <mc:AlternateContent>
           <mc:Choice Requires="wps">
@@ -614,6 +455,8 @@
       <w:r>
         <w:rPr>
           <w:noProof/>
+          <w:sz w:val="24"/>
+          <w:szCs w:val="24"/>
         </w:rPr>
         <mc:AlternateContent>
           <mc:Choice Requires="wps">
@@ -681,555 +524,335 @@
           </mc:Fallback>
         </mc:AlternateContent>
       </w:r>
+      <w:r>
+        <w:rPr>
+          <w:sz w:val="24"/>
+          <w:szCs w:val="24"/>
+        </w:rPr>
+        <w:t xml:space="preserve">Pressionando a chave </w:t>
+      </w:r>
+      <w:r>
+        <w:rPr>
+          <w:b/>
+          <w:bCs/>
+          <w:sz w:val="24"/>
+          <w:szCs w:val="24"/>
+        </w:rPr>
+        <w:t>KEY</w:t>
+      </w:r>
+      <w:r>
+        <w:rPr>
+          <w:sz w:val="24"/>
+          <w:szCs w:val="24"/>
+        </w:rPr>
+        <w:t xml:space="preserve"> no modulo </w:t>
+      </w:r>
       <w:proofErr w:type="spellStart"/>
       <w:r>
-        <w:t>Pressionando</w:t>
+        <w:rPr>
+          <w:sz w:val="24"/>
+          <w:szCs w:val="24"/>
+        </w:rPr>
+        <w:t>BlackPill</w:t>
       </w:r>
       <w:proofErr w:type="spellEnd"/>
       <w:r>
-        <w:t xml:space="preserve"> a </w:t>
+        <w:rPr>
+          <w:sz w:val="24"/>
+          <w:szCs w:val="24"/>
+        </w:rPr>
+        <w:t xml:space="preserve">, o LED azul se apaga e o programa entra no modo de alteração da </w:t>
       </w:r>
       <w:proofErr w:type="spellStart"/>
       <w:r>
-        <w:t>chave</w:t>
+        <w:rPr>
+          <w:sz w:val="24"/>
+          <w:szCs w:val="24"/>
+        </w:rPr>
+        <w:t>baudrate</w:t>
       </w:r>
       <w:proofErr w:type="spellEnd"/>
       <w:r>
+        <w:rPr>
+          <w:sz w:val="24"/>
+          <w:szCs w:val="24"/>
+        </w:rPr>
+        <w:t xml:space="preserve">. Pressionado qualquer botão de seleção de </w:t>
+      </w:r>
+      <w:proofErr w:type="spellStart"/>
+      <w:r>
+        <w:rPr>
+          <w:sz w:val="24"/>
+          <w:szCs w:val="24"/>
+        </w:rPr>
+        <w:t>baudrate</w:t>
+      </w:r>
+      <w:proofErr w:type="spellEnd"/>
+      <w:r>
+        <w:rPr>
+          <w:sz w:val="24"/>
+          <w:szCs w:val="24"/>
+        </w:rPr>
+        <w:t xml:space="preserve">, o programa altera a </w:t>
+      </w:r>
+      <w:proofErr w:type="spellStart"/>
+      <w:r>
+        <w:rPr>
+          <w:sz w:val="24"/>
+          <w:szCs w:val="24"/>
+        </w:rPr>
+        <w:t>baudrate</w:t>
+      </w:r>
+      <w:proofErr w:type="spellEnd"/>
+      <w:r>
+        <w:rPr>
+          <w:sz w:val="24"/>
+          <w:szCs w:val="24"/>
+        </w:rPr>
+        <w:t xml:space="preserve"> para o valor correspondente ao botão e o LED piscará o número de vezes corresponde e o módulo </w:t>
+      </w:r>
+      <w:proofErr w:type="spellStart"/>
+      <w:r>
+        <w:rPr>
+          <w:sz w:val="24"/>
+          <w:szCs w:val="24"/>
+        </w:rPr>
+        <w:t>BlackPill</w:t>
+      </w:r>
+      <w:proofErr w:type="spellEnd"/>
+      <w:r>
+        <w:rPr>
+          <w:sz w:val="24"/>
+          <w:szCs w:val="24"/>
+        </w:rPr>
+        <w:t xml:space="preserve"> reinicia. Se o modulo já estiver na velocidade/</w:t>
+      </w:r>
+      <w:proofErr w:type="spellStart"/>
+      <w:r>
+        <w:rPr>
+          <w:sz w:val="24"/>
+          <w:szCs w:val="24"/>
+        </w:rPr>
+        <w:t>baudrate</w:t>
+      </w:r>
+      <w:proofErr w:type="spellEnd"/>
+      <w:r>
+        <w:rPr>
+          <w:sz w:val="24"/>
+          <w:szCs w:val="24"/>
+        </w:rPr>
+        <w:t xml:space="preserve"> que se deseja, o led piscará</w:t>
+      </w:r>
+      <w:r>
+        <w:rPr>
+          <w:sz w:val="24"/>
+          <w:szCs w:val="24"/>
+        </w:rPr>
         <w:t xml:space="preserve"> </w:t>
       </w:r>
       <w:r>
         <w:rPr>
-          <w:b/>
-          <w:bCs/>
-        </w:rPr>
-        <w:t>KEY</w:t>
-      </w:r>
-      <w:r>
-        <w:t xml:space="preserve"> no modulo </w:t>
+          <w:sz w:val="24"/>
+          <w:szCs w:val="24"/>
+        </w:rPr>
+        <w:t>10 vezes rapidamente.</w:t>
+      </w:r>
+      <w:r>
+        <w:rPr>
+          <w:sz w:val="24"/>
+          <w:szCs w:val="24"/>
+        </w:rPr>
+        <w:br/>
+      </w:r>
+      <w:r>
+        <w:rPr>
+          <w:sz w:val="24"/>
+          <w:szCs w:val="24"/>
+        </w:rPr>
+        <w:br/>
+      </w:r>
+      <w:r>
+        <w:rPr>
+          <w:sz w:val="24"/>
+          <w:szCs w:val="24"/>
+        </w:rPr>
+        <w:t xml:space="preserve">Colocando a chave </w:t>
+      </w:r>
+      <w:r>
+        <w:rPr>
+          <w:b/>
+          <w:bCs/>
+          <w:sz w:val="24"/>
+          <w:szCs w:val="24"/>
+        </w:rPr>
+        <w:t>TIPO</w:t>
+      </w:r>
+      <w:r>
+        <w:rPr>
+          <w:sz w:val="24"/>
+          <w:szCs w:val="24"/>
+        </w:rPr>
+        <w:t xml:space="preserve"> na posição </w:t>
+      </w:r>
+      <w:r>
+        <w:rPr>
+          <w:b/>
+          <w:bCs/>
+          <w:sz w:val="24"/>
+          <w:szCs w:val="24"/>
+        </w:rPr>
+        <w:t>BLE</w:t>
+      </w:r>
+      <w:r>
+        <w:rPr>
+          <w:sz w:val="24"/>
+          <w:szCs w:val="24"/>
+        </w:rPr>
+        <w:t xml:space="preserve">, o modulo </w:t>
       </w:r>
       <w:proofErr w:type="spellStart"/>
       <w:r>
+        <w:rPr>
+          <w:sz w:val="24"/>
+          <w:szCs w:val="24"/>
+        </w:rPr>
         <w:t>BlackPill</w:t>
       </w:r>
       <w:proofErr w:type="spellEnd"/>
       <w:r>
-        <w:t xml:space="preserve">, o LED </w:t>
+        <w:rPr>
+          <w:sz w:val="24"/>
+          <w:szCs w:val="24"/>
+        </w:rPr>
+        <w:t xml:space="preserve"> é habilitado a controlar a </w:t>
       </w:r>
       <w:proofErr w:type="spellStart"/>
       <w:r>
-        <w:t>azul</w:t>
+        <w:rPr>
+          <w:sz w:val="24"/>
+          <w:szCs w:val="24"/>
+        </w:rPr>
+        <w:t>baudrate</w:t>
       </w:r>
       <w:proofErr w:type="spellEnd"/>
       <w:r>
-        <w:t xml:space="preserve"> se </w:t>
+        <w:rPr>
+          <w:sz w:val="24"/>
+          <w:szCs w:val="24"/>
+        </w:rPr>
+        <w:t xml:space="preserve"> de módulos BLE nome BT-05. </w:t>
+      </w:r>
+      <w:r>
+        <w:rPr>
+          <w:sz w:val="24"/>
+          <w:szCs w:val="24"/>
+        </w:rPr>
+        <w:t xml:space="preserve">Na posição </w:t>
+      </w:r>
+      <w:r>
+        <w:rPr>
+          <w:b/>
+          <w:bCs/>
+          <w:sz w:val="24"/>
+          <w:szCs w:val="24"/>
+        </w:rPr>
+        <w:t xml:space="preserve"> BLU </w:t>
+      </w:r>
+      <w:r>
+        <w:rPr>
+          <w:sz w:val="24"/>
+          <w:szCs w:val="24"/>
+        </w:rPr>
+        <w:t xml:space="preserve">Desligada a chave TIPO, o modulo </w:t>
       </w:r>
       <w:proofErr w:type="spellStart"/>
       <w:r>
-        <w:t>apaga</w:t>
+        <w:rPr>
+          <w:sz w:val="24"/>
+          <w:szCs w:val="24"/>
+        </w:rPr>
+        <w:t>BlackPill</w:t>
       </w:r>
       <w:proofErr w:type="spellEnd"/>
       <w:r>
-        <w:t xml:space="preserve"> e o </w:t>
+        <w:rPr>
+          <w:sz w:val="24"/>
+          <w:szCs w:val="24"/>
+        </w:rPr>
+        <w:t xml:space="preserve"> é habilitado a controlar a </w:t>
       </w:r>
       <w:proofErr w:type="spellStart"/>
       <w:r>
-        <w:t>programa</w:t>
+        <w:rPr>
+          <w:sz w:val="24"/>
+          <w:szCs w:val="24"/>
+        </w:rPr>
+        <w:t>baudreate</w:t>
       </w:r>
       <w:proofErr w:type="spellEnd"/>
       <w:r>
-        <w:t xml:space="preserve"> </w:t>
-      </w:r>
-      <w:proofErr w:type="spellStart"/>
-      <w:r>
-        <w:t>entra</w:t>
-      </w:r>
-      <w:proofErr w:type="spellEnd"/>
-      <w:r>
-        <w:t xml:space="preserve"> no modo de </w:t>
-      </w:r>
-      <w:proofErr w:type="spellStart"/>
-      <w:r>
-        <w:t>alteração</w:t>
-      </w:r>
-      <w:proofErr w:type="spellEnd"/>
-      <w:r>
-        <w:t xml:space="preserve"> da </w:t>
-      </w:r>
-      <w:proofErr w:type="spellStart"/>
-      <w:r>
-        <w:t>baudrate</w:t>
-      </w:r>
-      <w:proofErr w:type="spellEnd"/>
-      <w:r>
-        <w:t xml:space="preserve">. </w:t>
-      </w:r>
-      <w:proofErr w:type="spellStart"/>
-      <w:r>
-        <w:t>Pressionado</w:t>
-      </w:r>
-      <w:proofErr w:type="spellEnd"/>
-      <w:r>
-        <w:t xml:space="preserve"> </w:t>
-      </w:r>
-      <w:proofErr w:type="spellStart"/>
-      <w:r>
-        <w:t>qualquer</w:t>
-      </w:r>
-      <w:proofErr w:type="spellEnd"/>
-      <w:r>
-        <w:t xml:space="preserve"> </w:t>
-      </w:r>
-      <w:proofErr w:type="spellStart"/>
-      <w:r>
-        <w:t>botão</w:t>
-      </w:r>
-      <w:proofErr w:type="spellEnd"/>
-      <w:r>
-        <w:t xml:space="preserve"> de </w:t>
-      </w:r>
-      <w:proofErr w:type="spellStart"/>
-      <w:r>
-        <w:t>seleção</w:t>
-      </w:r>
-      <w:proofErr w:type="spellEnd"/>
-      <w:r>
-        <w:t xml:space="preserve"> de </w:t>
-      </w:r>
-      <w:proofErr w:type="spellStart"/>
-      <w:r>
-        <w:t>baudrate</w:t>
-      </w:r>
-      <w:proofErr w:type="spellEnd"/>
-      <w:r>
-        <w:t xml:space="preserve">, o </w:t>
-      </w:r>
-      <w:proofErr w:type="spellStart"/>
-      <w:r>
-        <w:t>programa</w:t>
-      </w:r>
-      <w:proofErr w:type="spellEnd"/>
-      <w:r>
-        <w:t xml:space="preserve"> altera a </w:t>
-      </w:r>
-      <w:proofErr w:type="spellStart"/>
-      <w:r>
-        <w:t>baudrate</w:t>
-      </w:r>
-      <w:proofErr w:type="spellEnd"/>
-      <w:r>
-        <w:t xml:space="preserve"> para o valor </w:t>
-      </w:r>
-      <w:proofErr w:type="spellStart"/>
-      <w:r>
-        <w:t>correspondente</w:t>
-      </w:r>
-      <w:proofErr w:type="spellEnd"/>
-      <w:r>
-        <w:t xml:space="preserve"> </w:t>
-      </w:r>
-      <w:proofErr w:type="spellStart"/>
-      <w:r>
-        <w:t>ao</w:t>
-      </w:r>
-      <w:proofErr w:type="spellEnd"/>
-      <w:r>
-        <w:t xml:space="preserve"> </w:t>
-      </w:r>
-      <w:proofErr w:type="spellStart"/>
-      <w:r>
-        <w:t>botão</w:t>
-      </w:r>
-      <w:proofErr w:type="spellEnd"/>
-      <w:r>
-        <w:t xml:space="preserve"> e o LED </w:t>
-      </w:r>
-      <w:proofErr w:type="spellStart"/>
-      <w:r>
-        <w:t>piscará</w:t>
-      </w:r>
-      <w:proofErr w:type="spellEnd"/>
-      <w:r>
-        <w:t xml:space="preserve"> o </w:t>
-      </w:r>
-      <w:proofErr w:type="spellStart"/>
-      <w:r>
-        <w:t>número</w:t>
-      </w:r>
-      <w:proofErr w:type="spellEnd"/>
-      <w:r>
-        <w:t xml:space="preserve"> de </w:t>
-      </w:r>
-      <w:proofErr w:type="spellStart"/>
-      <w:r>
-        <w:t>vezes</w:t>
-      </w:r>
-      <w:proofErr w:type="spellEnd"/>
-      <w:r>
-        <w:t xml:space="preserve"> </w:t>
-      </w:r>
-      <w:proofErr w:type="spellStart"/>
-      <w:r>
-        <w:t>corresponde</w:t>
-      </w:r>
-      <w:proofErr w:type="spellEnd"/>
-      <w:r>
-        <w:t xml:space="preserve"> e o </w:t>
-      </w:r>
-      <w:proofErr w:type="spellStart"/>
-      <w:r>
-        <w:t>módulo</w:t>
-      </w:r>
-      <w:proofErr w:type="spellEnd"/>
-      <w:r>
-        <w:t xml:space="preserve"> </w:t>
-      </w:r>
-      <w:proofErr w:type="spellStart"/>
-      <w:r>
-        <w:t>BlackPill</w:t>
-      </w:r>
-      <w:proofErr w:type="spellEnd"/>
-      <w:r>
-        <w:t xml:space="preserve"> </w:t>
-      </w:r>
-      <w:proofErr w:type="spellStart"/>
-      <w:r>
-        <w:t>reinicia</w:t>
-      </w:r>
-      <w:proofErr w:type="spellEnd"/>
-      <w:r>
-        <w:t xml:space="preserve">. Se o modulo </w:t>
-      </w:r>
-      <w:proofErr w:type="spellStart"/>
-      <w:r>
-        <w:t>já</w:t>
-      </w:r>
-      <w:proofErr w:type="spellEnd"/>
-      <w:r>
-        <w:t xml:space="preserve"> </w:t>
-      </w:r>
-      <w:proofErr w:type="spellStart"/>
-      <w:r>
-        <w:t>estiver</w:t>
-      </w:r>
-      <w:proofErr w:type="spellEnd"/>
-      <w:r>
-        <w:t xml:space="preserve"> </w:t>
-      </w:r>
-      <w:proofErr w:type="spellStart"/>
-      <w:r>
-        <w:t>na</w:t>
-      </w:r>
-      <w:proofErr w:type="spellEnd"/>
-      <w:r>
-        <w:t xml:space="preserve"> </w:t>
-      </w:r>
-      <w:proofErr w:type="spellStart"/>
-      <w:r>
-        <w:t>velocidade</w:t>
-      </w:r>
-      <w:proofErr w:type="spellEnd"/>
-      <w:r>
-        <w:t>/</w:t>
-      </w:r>
-      <w:proofErr w:type="spellStart"/>
-      <w:r>
-        <w:t>baudrate</w:t>
-      </w:r>
-      <w:proofErr w:type="spellEnd"/>
-      <w:r>
-        <w:t xml:space="preserve"> que se </w:t>
-      </w:r>
-      <w:proofErr w:type="spellStart"/>
-      <w:r>
-        <w:t>deseja</w:t>
-      </w:r>
-      <w:proofErr w:type="spellEnd"/>
-      <w:r>
-        <w:t xml:space="preserve">, o led </w:t>
-      </w:r>
-      <w:proofErr w:type="spellStart"/>
-      <w:r>
-        <w:t>piscará</w:t>
-      </w:r>
-      <w:proofErr w:type="spellEnd"/>
-      <w:r>
-        <w:t xml:space="preserve"> 10 </w:t>
-      </w:r>
-      <w:proofErr w:type="spellStart"/>
-      <w:r>
-        <w:t>vezes</w:t>
-      </w:r>
-      <w:proofErr w:type="spellEnd"/>
-      <w:r>
-        <w:t xml:space="preserve"> </w:t>
-      </w:r>
-      <w:proofErr w:type="spellStart"/>
-      <w:r>
-        <w:t>bem</w:t>
-      </w:r>
-      <w:proofErr w:type="spellEnd"/>
-      <w:r>
-        <w:t xml:space="preserve"> </w:t>
-      </w:r>
-      <w:proofErr w:type="spellStart"/>
-      <w:proofErr w:type="gramStart"/>
-      <w:r>
-        <w:t>rapidamente</w:t>
-      </w:r>
-      <w:proofErr w:type="spellEnd"/>
-      <w:r>
-        <w:t>..</w:t>
-      </w:r>
-      <w:proofErr w:type="gramEnd"/>
-      <w:r>
-        <w:br/>
-      </w:r>
-      <w:r>
-        <w:br/>
-      </w:r>
-      <w:proofErr w:type="spellStart"/>
-      <w:r>
-        <w:t>Colocando</w:t>
-      </w:r>
-      <w:proofErr w:type="spellEnd"/>
-      <w:r>
-        <w:t xml:space="preserve"> a </w:t>
-      </w:r>
-      <w:proofErr w:type="spellStart"/>
-      <w:r>
-        <w:t>chave</w:t>
-      </w:r>
-      <w:proofErr w:type="spellEnd"/>
-      <w:r>
-        <w:t xml:space="preserve"> </w:t>
-      </w:r>
-      <w:r>
-        <w:rPr>
-          <w:b/>
-          <w:bCs/>
-        </w:rPr>
-        <w:t>TIPO</w:t>
-      </w:r>
-      <w:r>
-        <w:t xml:space="preserve"> </w:t>
-      </w:r>
-      <w:proofErr w:type="spellStart"/>
-      <w:r>
-        <w:t>na</w:t>
-      </w:r>
-      <w:proofErr w:type="spellEnd"/>
-      <w:r>
-        <w:t xml:space="preserve"> </w:t>
-      </w:r>
-      <w:proofErr w:type="spellStart"/>
-      <w:r>
-        <w:t>posição</w:t>
-      </w:r>
-      <w:proofErr w:type="spellEnd"/>
-      <w:r>
-        <w:t xml:space="preserve"> </w:t>
-      </w:r>
-      <w:r>
-        <w:rPr>
-          <w:b/>
-          <w:bCs/>
-        </w:rPr>
-        <w:t>BLE</w:t>
-      </w:r>
-      <w:r>
-        <w:t xml:space="preserve">, o modulo </w:t>
-      </w:r>
-      <w:proofErr w:type="spellStart"/>
-      <w:r>
-        <w:t>BlackPill</w:t>
-      </w:r>
-      <w:proofErr w:type="spellEnd"/>
-      <w:r>
-        <w:t xml:space="preserve"> é </w:t>
-      </w:r>
-      <w:proofErr w:type="spellStart"/>
-      <w:r>
-        <w:t>habilitado</w:t>
-      </w:r>
-      <w:proofErr w:type="spellEnd"/>
-      <w:r>
-        <w:t xml:space="preserve"> a </w:t>
-      </w:r>
-      <w:proofErr w:type="spellStart"/>
-      <w:r>
-        <w:t>controlar</w:t>
-      </w:r>
-      <w:proofErr w:type="spellEnd"/>
-      <w:r>
-        <w:t xml:space="preserve"> a </w:t>
-      </w:r>
-      <w:proofErr w:type="spellStart"/>
-      <w:r>
-        <w:t>baudrate</w:t>
-      </w:r>
-      <w:proofErr w:type="spellEnd"/>
-      <w:r>
-        <w:t xml:space="preserve"> de </w:t>
-      </w:r>
-      <w:proofErr w:type="spellStart"/>
-      <w:r>
-        <w:t>módulos</w:t>
-      </w:r>
-      <w:proofErr w:type="spellEnd"/>
-      <w:r>
-        <w:t xml:space="preserve"> BLE </w:t>
-      </w:r>
-      <w:proofErr w:type="spellStart"/>
-      <w:r>
-        <w:t>nome</w:t>
-      </w:r>
-      <w:proofErr w:type="spellEnd"/>
-      <w:r>
-        <w:t xml:space="preserve"> BT-05. </w:t>
-      </w:r>
-      <w:r>
-        <w:t xml:space="preserve">Na </w:t>
-      </w:r>
-      <w:proofErr w:type="spellStart"/>
-      <w:proofErr w:type="gramStart"/>
-      <w:r>
-        <w:t>posição</w:t>
-      </w:r>
-      <w:proofErr w:type="spellEnd"/>
-      <w:r>
-        <w:t xml:space="preserve"> </w:t>
-      </w:r>
-      <w:r>
-        <w:rPr>
-          <w:b/>
-          <w:bCs/>
-        </w:rPr>
-        <w:t xml:space="preserve"> BLU</w:t>
-      </w:r>
-      <w:proofErr w:type="gramEnd"/>
-      <w:r>
-        <w:rPr>
-          <w:b/>
-          <w:bCs/>
-        </w:rPr>
-        <w:t xml:space="preserve"> </w:t>
-      </w:r>
-      <w:proofErr w:type="spellStart"/>
-      <w:r>
-        <w:t>Desligada</w:t>
-      </w:r>
-      <w:proofErr w:type="spellEnd"/>
-      <w:r>
-        <w:t xml:space="preserve"> a </w:t>
-      </w:r>
-      <w:proofErr w:type="spellStart"/>
-      <w:r>
-        <w:t>chave</w:t>
-      </w:r>
-      <w:proofErr w:type="spellEnd"/>
-      <w:r>
-        <w:t xml:space="preserve"> TIPO, o modulo </w:t>
-      </w:r>
-      <w:proofErr w:type="spellStart"/>
-      <w:r>
-        <w:t>BlackPill</w:t>
-      </w:r>
-      <w:proofErr w:type="spellEnd"/>
-      <w:r>
-        <w:t xml:space="preserve"> é </w:t>
-      </w:r>
-      <w:proofErr w:type="spellStart"/>
-      <w:r>
-        <w:t>habilitado</w:t>
-      </w:r>
-      <w:proofErr w:type="spellEnd"/>
-      <w:r>
-        <w:t xml:space="preserve"> a </w:t>
-      </w:r>
-      <w:proofErr w:type="spellStart"/>
-      <w:r>
-        <w:t>controlar</w:t>
-      </w:r>
-      <w:proofErr w:type="spellEnd"/>
-      <w:r>
-        <w:t xml:space="preserve"> a </w:t>
-      </w:r>
-      <w:proofErr w:type="spellStart"/>
-      <w:r>
-        <w:t>baudreate</w:t>
-      </w:r>
-      <w:proofErr w:type="spellEnd"/>
-      <w:r>
-        <w:t xml:space="preserve"> de </w:t>
-      </w:r>
-      <w:proofErr w:type="spellStart"/>
-      <w:r>
-        <w:t>módulos</w:t>
-      </w:r>
-      <w:proofErr w:type="spellEnd"/>
-      <w:r>
-        <w:t xml:space="preserve"> Bluetooth </w:t>
-      </w:r>
-      <w:proofErr w:type="spellStart"/>
-      <w:r>
-        <w:t>modelo</w:t>
-      </w:r>
-      <w:proofErr w:type="spellEnd"/>
-      <w:r>
-        <w:t xml:space="preserve"> HC-05. </w:t>
+        <w:rPr>
+          <w:sz w:val="24"/>
+          <w:szCs w:val="24"/>
+        </w:rPr>
+        <w:t xml:space="preserve"> de módulos Bluetooth modelo HC-05. </w:t>
       </w:r>
     </w:p>
     <w:p>
       <w:pPr>
         <w:ind w:right="-1065"/>
         <w:jc w:val="both"/>
+        <w:rPr>
+          <w:sz w:val="24"/>
+          <w:szCs w:val="24"/>
+        </w:rPr>
       </w:pPr>
     </w:p>
     <w:p>
       <w:pPr>
         <w:ind w:left="720" w:right="-1065" w:hanging="862"/>
         <w:jc w:val="both"/>
+        <w:rPr>
+          <w:sz w:val="24"/>
+          <w:szCs w:val="24"/>
+        </w:rPr>
       </w:pPr>
       <w:r>
+        <w:rPr>
+          <w:sz w:val="24"/>
+          <w:szCs w:val="24"/>
+        </w:rPr>
         <w:t xml:space="preserve">  </w:t>
       </w:r>
       <w:r>
-        <w:t xml:space="preserve">Para </w:t>
+        <w:rPr>
+          <w:sz w:val="24"/>
+          <w:szCs w:val="24"/>
+        </w:rPr>
+        <w:t xml:space="preserve">Para alterar a </w:t>
       </w:r>
       <w:proofErr w:type="spellStart"/>
       <w:r>
-        <w:t>alterar</w:t>
+        <w:rPr>
+          <w:sz w:val="24"/>
+          <w:szCs w:val="24"/>
+        </w:rPr>
+        <w:t>baudrate</w:t>
       </w:r>
       <w:proofErr w:type="spellEnd"/>
       <w:r>
-        <w:t xml:space="preserve"> a </w:t>
-      </w:r>
-      <w:proofErr w:type="spellStart"/>
-      <w:r>
-        <w:t>baudrate</w:t>
-      </w:r>
-      <w:proofErr w:type="spellEnd"/>
-      <w:r>
+        <w:rPr>
+          <w:sz w:val="24"/>
+          <w:szCs w:val="24"/>
+        </w:rPr>
         <w:t xml:space="preserve"> n</w:t>
       </w:r>
       <w:r>
-        <w:t xml:space="preserve">o </w:t>
-      </w:r>
-      <w:proofErr w:type="spellStart"/>
-      <w:r>
-        <w:t>tipo</w:t>
-      </w:r>
-      <w:proofErr w:type="spellEnd"/>
-      <w:r>
-        <w:t xml:space="preserve"> BLE com </w:t>
-      </w:r>
-      <w:proofErr w:type="spellStart"/>
-      <w:r>
-        <w:t>nome</w:t>
-      </w:r>
-      <w:proofErr w:type="spellEnd"/>
-      <w:r>
-        <w:t xml:space="preserve"> BT-05:</w:t>
+        <w:rPr>
+          <w:sz w:val="24"/>
+          <w:szCs w:val="24"/>
+        </w:rPr>
+        <w:t>o tipo BLE com nome BT-05:</w:t>
       </w:r>
     </w:p>
     <w:p>
@@ -1239,12 +862,16 @@
         <w:rPr>
           <w:b/>
           <w:bCs/>
+          <w:sz w:val="24"/>
+          <w:szCs w:val="24"/>
         </w:rPr>
       </w:pPr>
       <w:r>
         <w:rPr>
           <w:b/>
           <w:bCs/>
+          <w:sz w:val="24"/>
+          <w:szCs w:val="24"/>
         </w:rPr>
         <w:t>4 – AT+BAUD4</w:t>
       </w:r>
@@ -1252,6 +879,8 @@
         <w:rPr>
           <w:b/>
           <w:bCs/>
+          <w:sz w:val="24"/>
+          <w:szCs w:val="24"/>
         </w:rPr>
         <w:t>\r\n</w:t>
       </w:r>
@@ -1259,31 +888,30 @@
         <w:rPr>
           <w:b/>
           <w:bCs/>
-        </w:rPr>
-        <w:t>-&gt; 9600 baud</w:t>
-      </w:r>
-      <w:r>
-        <w:rPr>
-          <w:b/>
-          <w:bCs/>
-        </w:rPr>
-        <w:t xml:space="preserve">       -</w:t>
-      </w:r>
-      <w:proofErr w:type="gramStart"/>
-      <w:r>
-        <w:rPr>
-          <w:b/>
-          <w:bCs/>
-        </w:rPr>
-        <w:t>&gt;  4</w:t>
-      </w:r>
-      <w:proofErr w:type="gramEnd"/>
-      <w:r>
-        <w:rPr>
-          <w:b/>
-          <w:bCs/>
-        </w:rPr>
-        <w:t xml:space="preserve"> piscadas</w:t>
+          <w:sz w:val="24"/>
+          <w:szCs w:val="24"/>
+        </w:rPr>
+        <w:t xml:space="preserve">-&gt; 9600 </w:t>
+      </w:r>
+      <w:proofErr w:type="spellStart"/>
+      <w:r>
+        <w:rPr>
+          <w:b/>
+          <w:bCs/>
+          <w:sz w:val="24"/>
+          <w:szCs w:val="24"/>
+        </w:rPr>
+        <w:t>baud</w:t>
+      </w:r>
+      <w:proofErr w:type="spellEnd"/>
+      <w:r>
+        <w:rPr>
+          <w:b/>
+          <w:bCs/>
+          <w:sz w:val="24"/>
+          <w:szCs w:val="24"/>
+        </w:rPr>
+        <w:t xml:space="preserve">       -&gt;  4 piscadas</w:t>
       </w:r>
     </w:p>
     <w:p>
@@ -1293,11 +921,15 @@
         <w:rPr>
           <w:b/>
           <w:bCs/>
+          <w:sz w:val="24"/>
+          <w:szCs w:val="24"/>
         </w:rPr>
       </w:pPr>
       <w:r>
         <w:rPr>
           <w:noProof/>
+          <w:sz w:val="24"/>
+          <w:szCs w:val="24"/>
         </w:rPr>
         <mc:AlternateContent>
           <mc:Choice Requires="wps">
@@ -1412,6 +1044,8 @@
         <w:rPr>
           <w:b/>
           <w:bCs/>
+          <w:sz w:val="24"/>
+          <w:szCs w:val="24"/>
         </w:rPr>
         <w:t>5 – AT+BAUD5</w:t>
       </w:r>
@@ -1419,6 +1053,8 @@
         <w:rPr>
           <w:b/>
           <w:bCs/>
+          <w:sz w:val="24"/>
+          <w:szCs w:val="24"/>
         </w:rPr>
         <w:t>\r\n</w:t>
       </w:r>
@@ -1426,31 +1062,30 @@
         <w:rPr>
           <w:b/>
           <w:bCs/>
-        </w:rPr>
-        <w:t xml:space="preserve"> -&gt; 19200 baud</w:t>
-      </w:r>
-      <w:r>
-        <w:rPr>
-          <w:b/>
-          <w:bCs/>
-        </w:rPr>
-        <w:t xml:space="preserve">    -</w:t>
-      </w:r>
-      <w:proofErr w:type="gramStart"/>
-      <w:r>
-        <w:rPr>
-          <w:b/>
-          <w:bCs/>
-        </w:rPr>
-        <w:t>&gt;  5</w:t>
-      </w:r>
-      <w:proofErr w:type="gramEnd"/>
-      <w:r>
-        <w:rPr>
-          <w:b/>
-          <w:bCs/>
-        </w:rPr>
-        <w:t xml:space="preserve"> piscadas</w:t>
+          <w:sz w:val="24"/>
+          <w:szCs w:val="24"/>
+        </w:rPr>
+        <w:t xml:space="preserve"> -&gt; 19200 </w:t>
+      </w:r>
+      <w:proofErr w:type="spellStart"/>
+      <w:r>
+        <w:rPr>
+          <w:b/>
+          <w:bCs/>
+          <w:sz w:val="24"/>
+          <w:szCs w:val="24"/>
+        </w:rPr>
+        <w:t>baud</w:t>
+      </w:r>
+      <w:proofErr w:type="spellEnd"/>
+      <w:r>
+        <w:rPr>
+          <w:b/>
+          <w:bCs/>
+          <w:sz w:val="24"/>
+          <w:szCs w:val="24"/>
+        </w:rPr>
+        <w:t xml:space="preserve">    -&gt;  5 piscadas</w:t>
       </w:r>
     </w:p>
     <w:p>
@@ -1460,12 +1095,16 @@
         <w:rPr>
           <w:b/>
           <w:bCs/>
+          <w:sz w:val="24"/>
+          <w:szCs w:val="24"/>
         </w:rPr>
       </w:pPr>
       <w:r>
         <w:rPr>
           <w:b/>
           <w:bCs/>
+          <w:sz w:val="24"/>
+          <w:szCs w:val="24"/>
         </w:rPr>
         <w:t>6 – AT+BAUD6</w:t>
       </w:r>
@@ -1473,45 +1112,39 @@
         <w:rPr>
           <w:b/>
           <w:bCs/>
-        </w:rPr>
-        <w:t>\r\n</w:t>
-      </w:r>
-      <w:r>
-        <w:rPr>
-          <w:b/>
-          <w:bCs/>
-        </w:rPr>
-        <w:t xml:space="preserve"> </w:t>
-      </w:r>
-      <w:r>
-        <w:rPr>
-          <w:b/>
-          <w:bCs/>
-        </w:rPr>
-        <w:t>-&gt; 38400 baud</w:t>
-      </w:r>
-      <w:r>
-        <w:rPr>
-          <w:b/>
-          <w:bCs/>
-        </w:rPr>
-        <w:t xml:space="preserve">    -</w:t>
-      </w:r>
-      <w:proofErr w:type="gramStart"/>
-      <w:r>
-        <w:rPr>
-          <w:b/>
-          <w:bCs/>
-        </w:rPr>
-        <w:t>&gt;  6</w:t>
-      </w:r>
-      <w:proofErr w:type="gramEnd"/>
-      <w:r>
-        <w:rPr>
-          <w:b/>
-          <w:bCs/>
-        </w:rPr>
-        <w:t xml:space="preserve"> piscadas</w:t>
+          <w:sz w:val="24"/>
+          <w:szCs w:val="24"/>
+        </w:rPr>
+        <w:t xml:space="preserve">\r\n </w:t>
+      </w:r>
+      <w:r>
+        <w:rPr>
+          <w:b/>
+          <w:bCs/>
+          <w:sz w:val="24"/>
+          <w:szCs w:val="24"/>
+        </w:rPr>
+        <w:t xml:space="preserve">-&gt; 38400 </w:t>
+      </w:r>
+      <w:proofErr w:type="spellStart"/>
+      <w:r>
+        <w:rPr>
+          <w:b/>
+          <w:bCs/>
+          <w:sz w:val="24"/>
+          <w:szCs w:val="24"/>
+        </w:rPr>
+        <w:t>baud</w:t>
+      </w:r>
+      <w:proofErr w:type="spellEnd"/>
+      <w:r>
+        <w:rPr>
+          <w:b/>
+          <w:bCs/>
+          <w:sz w:val="24"/>
+          <w:szCs w:val="24"/>
+        </w:rPr>
+        <w:t xml:space="preserve">    -&gt;  6 piscadas</w:t>
       </w:r>
     </w:p>
     <w:p>
@@ -1521,12 +1154,16 @@
         <w:rPr>
           <w:b/>
           <w:bCs/>
+          <w:sz w:val="24"/>
+          <w:szCs w:val="24"/>
         </w:rPr>
       </w:pPr>
       <w:r>
         <w:rPr>
           <w:b/>
           <w:bCs/>
+          <w:sz w:val="24"/>
+          <w:szCs w:val="24"/>
         </w:rPr>
         <w:t>7 – AT+BAUD7</w:t>
       </w:r>
@@ -1534,6 +1171,8 @@
         <w:rPr>
           <w:b/>
           <w:bCs/>
+          <w:sz w:val="24"/>
+          <w:szCs w:val="24"/>
         </w:rPr>
         <w:t>\r\n</w:t>
       </w:r>
@@ -1541,31 +1180,30 @@
         <w:rPr>
           <w:b/>
           <w:bCs/>
-        </w:rPr>
-        <w:t xml:space="preserve"> -&gt; 57600 baud</w:t>
-      </w:r>
-      <w:r>
-        <w:rPr>
-          <w:b/>
-          <w:bCs/>
-        </w:rPr>
-        <w:t xml:space="preserve">    -</w:t>
-      </w:r>
-      <w:proofErr w:type="gramStart"/>
-      <w:r>
-        <w:rPr>
-          <w:b/>
-          <w:bCs/>
-        </w:rPr>
-        <w:t>&gt;  7</w:t>
-      </w:r>
-      <w:proofErr w:type="gramEnd"/>
-      <w:r>
-        <w:rPr>
-          <w:b/>
-          <w:bCs/>
-        </w:rPr>
-        <w:t xml:space="preserve"> piscadas</w:t>
+          <w:sz w:val="24"/>
+          <w:szCs w:val="24"/>
+        </w:rPr>
+        <w:t xml:space="preserve"> -&gt; 57600 </w:t>
+      </w:r>
+      <w:proofErr w:type="spellStart"/>
+      <w:r>
+        <w:rPr>
+          <w:b/>
+          <w:bCs/>
+          <w:sz w:val="24"/>
+          <w:szCs w:val="24"/>
+        </w:rPr>
+        <w:t>baud</w:t>
+      </w:r>
+      <w:proofErr w:type="spellEnd"/>
+      <w:r>
+        <w:rPr>
+          <w:b/>
+          <w:bCs/>
+          <w:sz w:val="24"/>
+          <w:szCs w:val="24"/>
+        </w:rPr>
+        <w:t xml:space="preserve">    -&gt;  7 piscadas</w:t>
       </w:r>
     </w:p>
     <w:p>
@@ -1575,12 +1213,16 @@
         <w:rPr>
           <w:b/>
           <w:bCs/>
+          <w:sz w:val="24"/>
+          <w:szCs w:val="24"/>
         </w:rPr>
       </w:pPr>
       <w:r>
         <w:rPr>
           <w:b/>
           <w:bCs/>
+          <w:sz w:val="24"/>
+          <w:szCs w:val="24"/>
         </w:rPr>
         <w:tab/>
         <w:t>8 – AT+BAUD2</w:t>
@@ -1589,6 +1231,8 @@
         <w:rPr>
           <w:b/>
           <w:bCs/>
+          <w:sz w:val="24"/>
+          <w:szCs w:val="24"/>
         </w:rPr>
         <w:t>\r\n</w:t>
       </w:r>
@@ -1596,27 +1240,28 @@
         <w:rPr>
           <w:b/>
           <w:bCs/>
-        </w:rPr>
-        <w:t xml:space="preserve"> -&gt; </w:t>
-      </w:r>
-      <w:r>
-        <w:rPr>
-          <w:b/>
-          <w:bCs/>
-        </w:rPr>
-        <w:t>115</w:t>
-      </w:r>
-      <w:r>
-        <w:rPr>
-          <w:b/>
-          <w:bCs/>
-        </w:rPr>
-        <w:t>200 baud</w:t>
-      </w:r>
-      <w:r>
-        <w:rPr>
-          <w:b/>
-          <w:bCs/>
+          <w:sz w:val="24"/>
+          <w:szCs w:val="24"/>
+        </w:rPr>
+        <w:t xml:space="preserve"> -&gt; 115200 </w:t>
+      </w:r>
+      <w:proofErr w:type="spellStart"/>
+      <w:r>
+        <w:rPr>
+          <w:b/>
+          <w:bCs/>
+          <w:sz w:val="24"/>
+          <w:szCs w:val="24"/>
+        </w:rPr>
+        <w:t>baud</w:t>
+      </w:r>
+      <w:proofErr w:type="spellEnd"/>
+      <w:r>
+        <w:rPr>
+          <w:b/>
+          <w:bCs/>
+          <w:sz w:val="24"/>
+          <w:szCs w:val="24"/>
         </w:rPr>
         <w:t xml:space="preserve"> -&gt;   8 piscadas</w:t>
       </w:r>
@@ -1628,31 +1273,39 @@
         <w:rPr>
           <w:b/>
           <w:bCs/>
+          <w:sz w:val="24"/>
+          <w:szCs w:val="24"/>
         </w:rPr>
       </w:pPr>
       <w:r>
-        <w:t xml:space="preserve">Para </w:t>
+        <w:rPr>
+          <w:sz w:val="24"/>
+          <w:szCs w:val="24"/>
+        </w:rPr>
+        <w:t xml:space="preserve">Para consultar a </w:t>
       </w:r>
       <w:proofErr w:type="spellStart"/>
       <w:r>
-        <w:t>consultar</w:t>
+        <w:rPr>
+          <w:sz w:val="24"/>
+          <w:szCs w:val="24"/>
+        </w:rPr>
+        <w:t>baudrate</w:t>
       </w:r>
       <w:proofErr w:type="spellEnd"/>
       <w:r>
-        <w:t xml:space="preserve"> a </w:t>
-      </w:r>
-      <w:proofErr w:type="spellStart"/>
-      <w:r>
-        <w:t>baudrate</w:t>
-      </w:r>
-      <w:proofErr w:type="spellEnd"/>
-      <w:r>
+        <w:rPr>
+          <w:sz w:val="24"/>
+          <w:szCs w:val="24"/>
+        </w:rPr>
         <w:t xml:space="preserve">: </w:t>
       </w:r>
       <w:r>
         <w:rPr>
           <w:b/>
           <w:bCs/>
+          <w:sz w:val="24"/>
+          <w:szCs w:val="24"/>
         </w:rPr>
         <w:t>AT+BAUD\r\n</w:t>
       </w:r>
@@ -1664,6 +1317,8 @@
         <w:rPr>
           <w:b/>
           <w:bCs/>
+          <w:sz w:val="24"/>
+          <w:szCs w:val="24"/>
         </w:rPr>
       </w:pPr>
     </w:p>
@@ -1671,10 +1326,16 @@
       <w:pPr>
         <w:ind w:right="-1065"/>
         <w:jc w:val="both"/>
+        <w:rPr>
+          <w:sz w:val="24"/>
+          <w:szCs w:val="24"/>
+        </w:rPr>
       </w:pPr>
       <w:r>
         <w:rPr>
           <w:noProof/>
+          <w:sz w:val="24"/>
+          <w:szCs w:val="24"/>
         </w:rPr>
         <mc:AlternateContent>
           <mc:Choice Requires="wps">
@@ -1822,50 +1483,41 @@
         </mc:AlternateContent>
       </w:r>
       <w:r>
+        <w:rPr>
+          <w:sz w:val="24"/>
+          <w:szCs w:val="24"/>
+        </w:rPr>
         <w:t xml:space="preserve">Para </w:t>
       </w:r>
+      <w:r>
+        <w:rPr>
+          <w:sz w:val="24"/>
+          <w:szCs w:val="24"/>
+        </w:rPr>
+        <w:t xml:space="preserve">alterar a </w:t>
+      </w:r>
       <w:proofErr w:type="spellStart"/>
       <w:r>
-        <w:t>alterar</w:t>
+        <w:rPr>
+          <w:sz w:val="24"/>
+          <w:szCs w:val="24"/>
+        </w:rPr>
+        <w:t>baudrate</w:t>
       </w:r>
       <w:proofErr w:type="spellEnd"/>
       <w:r>
-        <w:t xml:space="preserve"> a </w:t>
-      </w:r>
-      <w:proofErr w:type="spellStart"/>
-      <w:r>
-        <w:t>baudrate</w:t>
-      </w:r>
-      <w:proofErr w:type="spellEnd"/>
-      <w:r>
+        <w:rPr>
+          <w:sz w:val="24"/>
+          <w:szCs w:val="24"/>
+        </w:rPr>
         <w:t xml:space="preserve"> n</w:t>
       </w:r>
       <w:r>
-        <w:t xml:space="preserve">o </w:t>
-      </w:r>
-      <w:proofErr w:type="spellStart"/>
-      <w:r>
-        <w:t>tipo</w:t>
-      </w:r>
-      <w:proofErr w:type="spellEnd"/>
-      <w:r>
-        <w:t xml:space="preserve"> Bluetooth </w:t>
-      </w:r>
-      <w:proofErr w:type="spellStart"/>
-      <w:r>
-        <w:t>modelo</w:t>
-      </w:r>
-      <w:proofErr w:type="spellEnd"/>
-      <w:r>
-        <w:t xml:space="preserve"> HC-05 e </w:t>
-      </w:r>
-      <w:proofErr w:type="spellStart"/>
-      <w:r>
-        <w:t>nome</w:t>
-      </w:r>
-      <w:proofErr w:type="spellEnd"/>
-      <w:r>
-        <w:t xml:space="preserve"> HC-05:</w:t>
+        <w:rPr>
+          <w:sz w:val="24"/>
+          <w:szCs w:val="24"/>
+        </w:rPr>
+        <w:t>o tipo Bluetooth modelo HC-05 e nome HC-05:</w:t>
       </w:r>
     </w:p>
     <w:p>
@@ -1875,51 +1527,38 @@
         <w:rPr>
           <w:b/>
           <w:bCs/>
+          <w:sz w:val="24"/>
+          <w:szCs w:val="24"/>
         </w:rPr>
       </w:pPr>
       <w:r>
         <w:rPr>
           <w:b/>
           <w:bCs/>
-        </w:rPr>
-        <w:t>4 – AT+</w:t>
-      </w:r>
-      <w:r>
-        <w:rPr>
-          <w:b/>
-          <w:bCs/>
-        </w:rPr>
-        <w:t>UART=9600,0,0\r\n</w:t>
-      </w:r>
-      <w:r>
-        <w:rPr>
-          <w:b/>
-          <w:bCs/>
-        </w:rPr>
-        <w:t xml:space="preserve"> -&gt; 9600 baud</w:t>
-      </w:r>
-      <w:r>
-        <w:rPr>
-          <w:b/>
-          <w:bCs/>
-        </w:rPr>
-        <w:t xml:space="preserve">            -</w:t>
-      </w:r>
-      <w:proofErr w:type="gramStart"/>
-      <w:r>
-        <w:rPr>
-          <w:b/>
-          <w:bCs/>
-        </w:rPr>
-        <w:t>&gt;  4</w:t>
-      </w:r>
-      <w:proofErr w:type="gramEnd"/>
-      <w:r>
-        <w:rPr>
-          <w:b/>
-          <w:bCs/>
-        </w:rPr>
-        <w:t xml:space="preserve"> piscadas</w:t>
+          <w:sz w:val="24"/>
+          <w:szCs w:val="24"/>
+        </w:rPr>
+        <w:t xml:space="preserve">4 – AT+UART=9600,0,0\r\n -&gt; 9600 </w:t>
+      </w:r>
+      <w:proofErr w:type="spellStart"/>
+      <w:r>
+        <w:rPr>
+          <w:b/>
+          <w:bCs/>
+          <w:sz w:val="24"/>
+          <w:szCs w:val="24"/>
+        </w:rPr>
+        <w:t>baud</w:t>
+      </w:r>
+      <w:proofErr w:type="spellEnd"/>
+      <w:r>
+        <w:rPr>
+          <w:b/>
+          <w:bCs/>
+          <w:sz w:val="24"/>
+          <w:szCs w:val="24"/>
+        </w:rPr>
+        <w:t xml:space="preserve">            -&gt;  4 piscadas</w:t>
       </w:r>
     </w:p>
     <w:p>
@@ -1929,11 +1568,15 @@
         <w:rPr>
           <w:b/>
           <w:bCs/>
+          <w:sz w:val="24"/>
+          <w:szCs w:val="24"/>
         </w:rPr>
       </w:pPr>
       <w:r>
         <w:rPr>
           <w:noProof/>
+          <w:sz w:val="24"/>
+          <w:szCs w:val="24"/>
         </w:rPr>
         <mc:AlternateContent>
           <mc:Choice Requires="wps">
@@ -2048,66 +1691,30 @@
         <w:rPr>
           <w:b/>
           <w:bCs/>
-        </w:rPr>
-        <w:t>5</w:t>
-      </w:r>
-      <w:r>
-        <w:rPr>
-          <w:b/>
-          <w:bCs/>
-        </w:rPr>
-        <w:t xml:space="preserve"> – AT+</w:t>
-      </w:r>
-      <w:r>
-        <w:rPr>
-          <w:b/>
-          <w:bCs/>
-        </w:rPr>
-        <w:t>UART=19200,0,0\r\n</w:t>
-      </w:r>
-      <w:r>
-        <w:rPr>
-          <w:b/>
-          <w:bCs/>
-        </w:rPr>
-        <w:t xml:space="preserve"> -&gt; </w:t>
-      </w:r>
-      <w:r>
-        <w:rPr>
-          <w:b/>
-          <w:bCs/>
-        </w:rPr>
-        <w:t>19200</w:t>
-      </w:r>
-      <w:r>
-        <w:rPr>
-          <w:b/>
-          <w:bCs/>
-        </w:rPr>
-        <w:t xml:space="preserve"> baud</w:t>
-      </w:r>
-      <w:r>
-        <w:rPr>
-          <w:b/>
-          <w:bCs/>
-        </w:rPr>
-        <w:t xml:space="preserve">       -</w:t>
-      </w:r>
-      <w:proofErr w:type="gramStart"/>
-      <w:r>
-        <w:rPr>
-          <w:b/>
-          <w:bCs/>
-        </w:rPr>
-        <w:t>&gt;  5</w:t>
-      </w:r>
-      <w:proofErr w:type="gramEnd"/>
-      <w:r>
-        <w:rPr>
-          <w:b/>
-          <w:bCs/>
-        </w:rPr>
-        <w:t xml:space="preserve"> piscadas</w:t>
+          <w:sz w:val="24"/>
+          <w:szCs w:val="24"/>
+        </w:rPr>
+        <w:t xml:space="preserve">5 – AT+UART=19200,0,0\r\n -&gt; 19200 </w:t>
+      </w:r>
+      <w:proofErr w:type="spellStart"/>
+      <w:r>
+        <w:rPr>
+          <w:b/>
+          <w:bCs/>
+          <w:sz w:val="24"/>
+          <w:szCs w:val="24"/>
+        </w:rPr>
+        <w:t>baud</w:t>
+      </w:r>
+      <w:proofErr w:type="spellEnd"/>
+      <w:r>
+        <w:rPr>
+          <w:b/>
+          <w:bCs/>
+          <w:sz w:val="24"/>
+          <w:szCs w:val="24"/>
+        </w:rPr>
+        <w:t xml:space="preserve">       -&gt;  5 piscadas</w:t>
       </w:r>
     </w:p>
     <w:p>
@@ -2117,72 +1724,38 @@
         <w:rPr>
           <w:b/>
           <w:bCs/>
+          <w:sz w:val="24"/>
+          <w:szCs w:val="24"/>
         </w:rPr>
       </w:pPr>
       <w:r>
         <w:rPr>
           <w:b/>
           <w:bCs/>
-        </w:rPr>
-        <w:t>6</w:t>
-      </w:r>
-      <w:r>
-        <w:rPr>
-          <w:b/>
-          <w:bCs/>
-        </w:rPr>
-        <w:t xml:space="preserve"> – AT+</w:t>
-      </w:r>
-      <w:r>
-        <w:rPr>
-          <w:b/>
-          <w:bCs/>
-        </w:rPr>
-        <w:t>UART=38400,0,0\r\n</w:t>
-      </w:r>
-      <w:r>
-        <w:rPr>
-          <w:b/>
-          <w:bCs/>
-        </w:rPr>
-        <w:t xml:space="preserve"> -&gt; </w:t>
-      </w:r>
-      <w:r>
-        <w:rPr>
-          <w:b/>
-          <w:bCs/>
-        </w:rPr>
-        <w:t>38400</w:t>
-      </w:r>
-      <w:r>
-        <w:rPr>
-          <w:b/>
-          <w:bCs/>
-        </w:rPr>
-        <w:t xml:space="preserve"> baud</w:t>
-      </w:r>
-      <w:r>
-        <w:rPr>
-          <w:b/>
-          <w:bCs/>
-        </w:rPr>
-        <w:t xml:space="preserve">       -</w:t>
-      </w:r>
-      <w:proofErr w:type="gramStart"/>
-      <w:r>
-        <w:rPr>
-          <w:b/>
-          <w:bCs/>
-        </w:rPr>
-        <w:t>&gt;  6</w:t>
-      </w:r>
-      <w:proofErr w:type="gramEnd"/>
-      <w:r>
-        <w:rPr>
-          <w:b/>
-          <w:bCs/>
-        </w:rPr>
-        <w:t xml:space="preserve"> piscadas</w:t>
+          <w:sz w:val="24"/>
+          <w:szCs w:val="24"/>
+        </w:rPr>
+        <w:t xml:space="preserve">6 – AT+UART=38400,0,0\r\n -&gt; 38400 </w:t>
+      </w:r>
+      <w:proofErr w:type="spellStart"/>
+      <w:r>
+        <w:rPr>
+          <w:b/>
+          <w:bCs/>
+          <w:sz w:val="24"/>
+          <w:szCs w:val="24"/>
+        </w:rPr>
+        <w:t>baud</w:t>
+      </w:r>
+      <w:proofErr w:type="spellEnd"/>
+      <w:r>
+        <w:rPr>
+          <w:b/>
+          <w:bCs/>
+          <w:sz w:val="24"/>
+          <w:szCs w:val="24"/>
+        </w:rPr>
+        <w:t xml:space="preserve">       -&gt;  6 piscadas</w:t>
       </w:r>
     </w:p>
     <w:p>
@@ -2192,12 +1765,16 @@
         <w:rPr>
           <w:b/>
           <w:bCs/>
+          <w:sz w:val="24"/>
+          <w:szCs w:val="24"/>
         </w:rPr>
       </w:pPr>
       <w:r>
         <w:rPr>
           <w:b/>
           <w:bCs/>
+          <w:sz w:val="24"/>
+          <w:szCs w:val="24"/>
         </w:rPr>
         <w:t>7</w:t>
       </w:r>
@@ -2205,6 +1782,8 @@
         <w:rPr>
           <w:b/>
           <w:bCs/>
+          <w:sz w:val="24"/>
+          <w:szCs w:val="24"/>
         </w:rPr>
         <w:t xml:space="preserve"> </w:t>
       </w:r>
@@ -2212,50 +1791,28 @@
         <w:rPr>
           <w:b/>
           <w:bCs/>
-        </w:rPr>
-        <w:t>– AT+</w:t>
-      </w:r>
-      <w:r>
-        <w:rPr>
-          <w:b/>
-          <w:bCs/>
-        </w:rPr>
-        <w:t>UART=57600,0,0\r\n</w:t>
-      </w:r>
-      <w:r>
-        <w:rPr>
-          <w:b/>
-          <w:bCs/>
-        </w:rPr>
-        <w:t xml:space="preserve"> -</w:t>
-      </w:r>
-      <w:proofErr w:type="gramStart"/>
-      <w:r>
-        <w:rPr>
-          <w:b/>
-          <w:bCs/>
-        </w:rPr>
-        <w:t xml:space="preserve">&gt; </w:t>
-      </w:r>
-      <w:r>
-        <w:rPr>
-          <w:b/>
-          <w:bCs/>
-        </w:rPr>
-        <w:t xml:space="preserve"> 57600</w:t>
-      </w:r>
-      <w:proofErr w:type="gramEnd"/>
-      <w:r>
-        <w:rPr>
-          <w:b/>
-          <w:bCs/>
-        </w:rPr>
-        <w:t xml:space="preserve"> baud</w:t>
-      </w:r>
-      <w:r>
-        <w:rPr>
-          <w:b/>
-          <w:bCs/>
+          <w:sz w:val="24"/>
+          <w:szCs w:val="24"/>
+        </w:rPr>
+        <w:t xml:space="preserve">– AT+UART=57600,0,0\r\n -&gt;  57600 </w:t>
+      </w:r>
+      <w:proofErr w:type="spellStart"/>
+      <w:r>
+        <w:rPr>
+          <w:b/>
+          <w:bCs/>
+          <w:sz w:val="24"/>
+          <w:szCs w:val="24"/>
+        </w:rPr>
+        <w:t>baud</w:t>
+      </w:r>
+      <w:proofErr w:type="spellEnd"/>
+      <w:r>
+        <w:rPr>
+          <w:b/>
+          <w:bCs/>
+          <w:sz w:val="24"/>
+          <w:szCs w:val="24"/>
         </w:rPr>
         <w:t xml:space="preserve">      -&gt;  7 piscadas</w:t>
       </w:r>
@@ -2267,62 +1824,45 @@
         <w:rPr>
           <w:b/>
           <w:bCs/>
+          <w:sz w:val="24"/>
+          <w:szCs w:val="24"/>
         </w:rPr>
       </w:pPr>
       <w:r>
         <w:rPr>
           <w:b/>
           <w:bCs/>
-        </w:rPr>
-        <w:t>8</w:t>
-      </w:r>
-      <w:r>
-        <w:rPr>
-          <w:b/>
-          <w:bCs/>
-        </w:rPr>
-        <w:t xml:space="preserve"> – AT+</w:t>
-      </w:r>
-      <w:r>
-        <w:rPr>
-          <w:b/>
-          <w:bCs/>
-        </w:rPr>
-        <w:t>UART=115200,0,0\r\n</w:t>
-      </w:r>
-      <w:r>
-        <w:rPr>
-          <w:b/>
-          <w:bCs/>
-        </w:rPr>
-        <w:t xml:space="preserve"> -&gt; </w:t>
-      </w:r>
-      <w:r>
-        <w:rPr>
-          <w:b/>
-          <w:bCs/>
-        </w:rPr>
-        <w:t>115200</w:t>
-      </w:r>
-      <w:r>
-        <w:rPr>
-          <w:b/>
-          <w:bCs/>
+          <w:sz w:val="24"/>
+          <w:szCs w:val="24"/>
+        </w:rPr>
+        <w:t xml:space="preserve">8 – AT+UART=115200,0,0\r\n -&gt; 115200 </w:t>
+      </w:r>
+      <w:proofErr w:type="spellStart"/>
+      <w:r>
+        <w:rPr>
+          <w:b/>
+          <w:bCs/>
+          <w:sz w:val="24"/>
+          <w:szCs w:val="24"/>
+        </w:rPr>
+        <w:t>baud</w:t>
+      </w:r>
+      <w:proofErr w:type="spellEnd"/>
+      <w:r>
+        <w:rPr>
+          <w:b/>
+          <w:bCs/>
+          <w:sz w:val="24"/>
+          <w:szCs w:val="24"/>
         </w:rPr>
         <w:t xml:space="preserve"> </w:t>
       </w:r>
-      <w:proofErr w:type="gramStart"/>
-      <w:r>
-        <w:rPr>
-          <w:b/>
-          <w:bCs/>
-        </w:rPr>
-        <w:t>baud</w:t>
-      </w:r>
-      <w:r>
-        <w:rPr>
-          <w:b/>
-          <w:bCs/>
+      <w:r>
+        <w:rPr>
+          <w:b/>
+          <w:bCs/>
+          <w:sz w:val="24"/>
+          <w:szCs w:val="24"/>
         </w:rPr>
         <w:t xml:space="preserve"> </w:t>
       </w:r>
@@ -2330,6 +1870,17 @@
         <w:rPr>
           <w:b/>
           <w:bCs/>
+          <w:sz w:val="24"/>
+          <w:szCs w:val="24"/>
+        </w:rPr>
+        <w:t>-&gt;</w:t>
+      </w:r>
+      <w:r>
+        <w:rPr>
+          <w:b/>
+          <w:bCs/>
+          <w:sz w:val="24"/>
+          <w:szCs w:val="24"/>
         </w:rPr>
         <w:t xml:space="preserve"> </w:t>
       </w:r>
@@ -2337,28 +1888,8 @@
         <w:rPr>
           <w:b/>
           <w:bCs/>
-        </w:rPr>
-        <w:t>-</w:t>
-      </w:r>
-      <w:proofErr w:type="gramEnd"/>
-      <w:r>
-        <w:rPr>
-          <w:b/>
-          <w:bCs/>
-        </w:rPr>
-        <w:t>&gt;</w:t>
-      </w:r>
-      <w:r>
-        <w:rPr>
-          <w:b/>
-          <w:bCs/>
-        </w:rPr>
-        <w:t xml:space="preserve"> </w:t>
-      </w:r>
-      <w:r>
-        <w:rPr>
-          <w:b/>
-          <w:bCs/>
+          <w:sz w:val="24"/>
+          <w:szCs w:val="24"/>
         </w:rPr>
         <w:t xml:space="preserve"> 8 piscadas</w:t>
       </w:r>
@@ -2370,53 +1901,60 @@
         <w:rPr>
           <w:b/>
           <w:bCs/>
+          <w:sz w:val="24"/>
+          <w:szCs w:val="24"/>
         </w:rPr>
       </w:pPr>
       <w:r>
-        <w:t xml:space="preserve">Para </w:t>
+        <w:rPr>
+          <w:sz w:val="24"/>
+          <w:szCs w:val="24"/>
+        </w:rPr>
+        <w:t xml:space="preserve">Para consultar a </w:t>
       </w:r>
       <w:proofErr w:type="spellStart"/>
       <w:r>
-        <w:t>consultar</w:t>
+        <w:rPr>
+          <w:sz w:val="24"/>
+          <w:szCs w:val="24"/>
+        </w:rPr>
+        <w:t>baudrate</w:t>
       </w:r>
       <w:proofErr w:type="spellEnd"/>
       <w:r>
-        <w:t xml:space="preserve"> a </w:t>
-      </w:r>
-      <w:proofErr w:type="spellStart"/>
-      <w:r>
-        <w:t>baudrate</w:t>
-      </w:r>
-      <w:proofErr w:type="spellEnd"/>
-      <w:r>
+        <w:rPr>
+          <w:sz w:val="24"/>
+          <w:szCs w:val="24"/>
+        </w:rPr>
         <w:t xml:space="preserve">: </w:t>
       </w:r>
       <w:r>
         <w:rPr>
           <w:b/>
           <w:bCs/>
-        </w:rPr>
-        <w:t>AT+</w:t>
-      </w:r>
-      <w:proofErr w:type="gramStart"/>
-      <w:r>
-        <w:rPr>
-          <w:b/>
-          <w:bCs/>
-        </w:rPr>
-        <w:t>UART?\r\n</w:t>
-      </w:r>
-      <w:proofErr w:type="gramEnd"/>
+          <w:sz w:val="24"/>
+          <w:szCs w:val="24"/>
+        </w:rPr>
+        <w:t>AT+UART?\r\n</w:t>
+      </w:r>
     </w:p>
     <w:p>
       <w:pPr>
         <w:ind w:left="720"/>
         <w:jc w:val="both"/>
+        <w:rPr>
+          <w:sz w:val="24"/>
+          <w:szCs w:val="24"/>
+        </w:rPr>
       </w:pPr>
     </w:p>
     <w:p>
       <w:pPr>
         <w:jc w:val="both"/>
+        <w:rPr>
+          <w:sz w:val="24"/>
+          <w:szCs w:val="24"/>
+        </w:rPr>
       </w:pPr>
     </w:p>
     <w:p>
@@ -2610,7 +2148,7 @@
     </w:p>
     <w:sectPr>
       <w:pgSz w:w="11906" w:h="16838"/>
-      <w:pgMar w:top="1417" w:right="282" w:bottom="1417" w:left="709" w:header="708" w:footer="708" w:gutter="0"/>
+      <w:pgMar w:top="709" w:right="282" w:bottom="709" w:left="709" w:header="708" w:footer="708" w:gutter="0"/>
       <w:cols w:num="2" w:space="2"/>
       <w:docGrid w:linePitch="360"/>
     </w:sectPr>
@@ -3027,7 +2565,6 @@
     <w:rPr>
       <w:rFonts w:ascii="Calibri" w:eastAsia="Calibri" w:hAnsi="Calibri" w:cs="Times New Roman"/>
       <w:kern w:val="0"/>
-      <w:lang w:val="en-US"/>
       <w14:ligatures w14:val="none"/>
     </w:rPr>
   </w:style>

</xml_diff>